<commit_message>
add new to WiFi docs
</commit_message>
<xml_diff>
--- a/Technical documentation/Wi-Fi module/progopis.docx
+++ b/Technical documentation/Wi-Fi module/progopis.docx
@@ -1438,7 +1438,1390 @@
     </w:p>
     <w:p>
       <w:pPr>
+        <w:pStyle w:val="a7"/>
+        <w:numPr>
+          <w:ilvl w:val="0"/>
+          <w:numId w:val="1"/>
+        </w:numPr>
         <w:spacing w:line="360" w:lineRule="auto"/>
+        <w:jc w:val="both"/>
+        <w:rPr>
+          <w:rFonts w:ascii="Times New Roman" w:hAnsi="Times New Roman" w:cs="Times New Roman"/>
+          <w:b/>
+          <w:bCs/>
+          <w:sz w:val="28"/>
+          <w:szCs w:val="28"/>
+        </w:rPr>
+      </w:pPr>
+      <w:r>
+        <w:rPr>
+          <w:rFonts w:ascii="Times New Roman" w:hAnsi="Times New Roman" w:cs="Times New Roman"/>
+          <w:b/>
+          <w:bCs/>
+          <w:sz w:val="28"/>
+          <w:szCs w:val="28"/>
+        </w:rPr>
+        <w:t>Инструкция по настройке и прошивке Wi-Fi модуля ESP8266</w:t>
+      </w:r>
+    </w:p>
+    <w:p>
+      <w:pPr>
+        <w:pStyle w:val="a7"/>
+        <w:numPr>
+          <w:ilvl w:val="1"/>
+          <w:numId w:val="1"/>
+        </w:numPr>
+        <w:spacing w:line="360" w:lineRule="auto"/>
+        <w:jc w:val="both"/>
+        <w:rPr>
+          <w:rFonts w:ascii="Times New Roman" w:hAnsi="Times New Roman" w:cs="Times New Roman"/>
+          <w:sz w:val="28"/>
+          <w:szCs w:val="28"/>
+        </w:rPr>
+      </w:pPr>
+      <w:r>
+        <w:rPr>
+          <w:rFonts w:ascii="Times New Roman" w:hAnsi="Times New Roman" w:cs="Times New Roman"/>
+          <w:sz w:val="28"/>
+          <w:szCs w:val="28"/>
+        </w:rPr>
+        <w:t xml:space="preserve"> Получение исходного кода </w:t>
+      </w:r>
+    </w:p>
+    <w:p>
+      <w:pPr>
+        <w:spacing w:line="360" w:lineRule="auto"/>
+        <w:jc w:val="both"/>
+        <w:rPr>
+          <w:rFonts w:ascii="Times New Roman" w:hAnsi="Times New Roman" w:cs="Times New Roman"/>
+          <w:sz w:val="28"/>
+          <w:szCs w:val="28"/>
+        </w:rPr>
+      </w:pPr>
+      <w:r>
+        <w:rPr>
+          <w:rFonts w:ascii="Times New Roman" w:hAnsi="Times New Roman" w:cs="Times New Roman"/>
+          <w:sz w:val="28"/>
+          <w:szCs w:val="28"/>
+        </w:rPr>
+        <w:t xml:space="preserve">Исходный код прошивки находится в репозитории </w:t>
+      </w:r>
+      <w:r>
+        <w:rPr>
+          <w:rFonts w:ascii="Times New Roman" w:hAnsi="Times New Roman" w:cs="Times New Roman"/>
+          <w:sz w:val="28"/>
+          <w:szCs w:val="28"/>
+          <w:lang w:val="en-US"/>
+        </w:rPr>
+        <w:t>Git</w:t>
+      </w:r>
+      <w:r>
+        <w:rPr>
+          <w:rFonts w:ascii="Times New Roman" w:hAnsi="Times New Roman" w:cs="Times New Roman"/>
+          <w:sz w:val="28"/>
+          <w:szCs w:val="28"/>
+        </w:rPr>
+        <w:t xml:space="preserve"> </w:t>
+      </w:r>
+      <w:r>
+        <w:rPr>
+          <w:rFonts w:ascii="Times New Roman" w:hAnsi="Times New Roman" w:cs="Times New Roman"/>
+          <w:sz w:val="28"/>
+          <w:szCs w:val="28"/>
+        </w:rPr>
+        <w:t xml:space="preserve">по пути: </w:t>
+      </w:r>
+      <w:r>
+        <w:rPr>
+          <w:rFonts w:ascii="Times New Roman" w:hAnsi="Times New Roman" w:cs="Times New Roman"/>
+          <w:sz w:val="28"/>
+          <w:szCs w:val="28"/>
+        </w:rPr>
+        <w:t>Source code/STM32Cube Project/esp8266.ino</w:t>
+      </w:r>
+    </w:p>
+    <w:p>
+      <w:pPr>
+        <w:pStyle w:val="a7"/>
+        <w:numPr>
+          <w:ilvl w:val="1"/>
+          <w:numId w:val="1"/>
+        </w:numPr>
+        <w:spacing w:line="360" w:lineRule="auto"/>
+        <w:jc w:val="both"/>
+        <w:rPr>
+          <w:rFonts w:ascii="Times New Roman" w:hAnsi="Times New Roman" w:cs="Times New Roman"/>
+          <w:sz w:val="28"/>
+          <w:szCs w:val="28"/>
+        </w:rPr>
+      </w:pPr>
+      <w:r>
+        <w:rPr>
+          <w:rFonts w:ascii="Times New Roman" w:hAnsi="Times New Roman" w:cs="Times New Roman"/>
+          <w:sz w:val="28"/>
+          <w:szCs w:val="28"/>
+        </w:rPr>
+        <w:t xml:space="preserve">Изменение настроек </w:t>
+      </w:r>
+      <w:r>
+        <w:rPr>
+          <w:rFonts w:ascii="Times New Roman" w:hAnsi="Times New Roman" w:cs="Times New Roman"/>
+          <w:sz w:val="28"/>
+          <w:szCs w:val="28"/>
+        </w:rPr>
+        <w:t>Wi-Fi</w:t>
+      </w:r>
+    </w:p>
+    <w:p>
+      <w:pPr>
+        <w:spacing w:line="360" w:lineRule="auto"/>
+        <w:jc w:val="both"/>
+        <w:rPr>
+          <w:rFonts w:ascii="Times New Roman" w:hAnsi="Times New Roman" w:cs="Times New Roman"/>
+          <w:sz w:val="28"/>
+          <w:szCs w:val="28"/>
+        </w:rPr>
+      </w:pPr>
+      <w:r>
+        <w:rPr>
+          <w:rFonts w:ascii="Times New Roman" w:hAnsi="Times New Roman" w:cs="Times New Roman"/>
+          <w:sz w:val="28"/>
+          <w:szCs w:val="28"/>
+        </w:rPr>
+        <w:t xml:space="preserve">В файле </w:t>
+      </w:r>
+      <w:r>
+        <w:rPr>
+          <w:rFonts w:ascii="Times New Roman" w:hAnsi="Times New Roman" w:cs="Times New Roman"/>
+          <w:sz w:val="28"/>
+          <w:szCs w:val="28"/>
+        </w:rPr>
+        <w:t>esp8266.ino</w:t>
+      </w:r>
+      <w:r>
+        <w:rPr>
+          <w:rFonts w:ascii="Times New Roman" w:hAnsi="Times New Roman" w:cs="Times New Roman"/>
+          <w:sz w:val="28"/>
+          <w:szCs w:val="28"/>
+        </w:rPr>
+        <w:t xml:space="preserve"> находятся следующие конфигурационные переменные:</w:t>
+      </w:r>
+    </w:p>
+    <w:p>
+      <w:pPr>
+        <w:spacing w:line="360" w:lineRule="auto"/>
+        <w:jc w:val="both"/>
+        <w:rPr>
+          <w:rFonts w:ascii="Times New Roman" w:hAnsi="Times New Roman" w:cs="Times New Roman"/>
+          <w:sz w:val="28"/>
+          <w:szCs w:val="28"/>
+          <w:lang w:val="en-US"/>
+        </w:rPr>
+      </w:pPr>
+      <w:r>
+        <w:rPr>
+          <w:rFonts w:ascii="Times New Roman" w:hAnsi="Times New Roman" w:cs="Times New Roman"/>
+          <w:sz w:val="28"/>
+          <w:szCs w:val="28"/>
+          <w:lang w:val="en-US"/>
+        </w:rPr>
+        <w:t>const char* ssid = "PoPaEsp";</w:t>
+      </w:r>
+    </w:p>
+    <w:p>
+      <w:pPr>
+        <w:spacing w:line="360" w:lineRule="auto"/>
+        <w:jc w:val="both"/>
+        <w:rPr>
+          <w:rFonts w:ascii="Times New Roman" w:hAnsi="Times New Roman" w:cs="Times New Roman"/>
+          <w:sz w:val="28"/>
+          <w:szCs w:val="28"/>
+          <w:lang w:val="en-US"/>
+        </w:rPr>
+      </w:pPr>
+      <w:r>
+        <w:rPr>
+          <w:rFonts w:ascii="Times New Roman" w:hAnsi="Times New Roman" w:cs="Times New Roman"/>
+          <w:sz w:val="28"/>
+          <w:szCs w:val="28"/>
+          <w:lang w:val="en-US"/>
+        </w:rPr>
+        <w:t>const char* pass = "bauns1337";</w:t>
+      </w:r>
+    </w:p>
+    <w:p>
+      <w:pPr>
+        <w:spacing w:line="360" w:lineRule="auto"/>
+        <w:jc w:val="both"/>
+        <w:rPr>
+          <w:rFonts w:ascii="Times New Roman" w:hAnsi="Times New Roman" w:cs="Times New Roman"/>
+          <w:sz w:val="28"/>
+          <w:szCs w:val="28"/>
+          <w:lang w:val="en-US"/>
+        </w:rPr>
+      </w:pPr>
+      <w:r>
+        <w:rPr>
+          <w:rFonts w:ascii="Times New Roman" w:hAnsi="Times New Roman" w:cs="Times New Roman"/>
+          <w:sz w:val="28"/>
+          <w:szCs w:val="28"/>
+          <w:lang w:val="en-US"/>
+        </w:rPr>
+        <w:t>IPAddress local_ip(192,168,5,1);</w:t>
+      </w:r>
+    </w:p>
+    <w:p>
+      <w:pPr>
+        <w:spacing w:line="360" w:lineRule="auto"/>
+        <w:jc w:val="both"/>
+        <w:rPr>
+          <w:rFonts w:ascii="Times New Roman" w:hAnsi="Times New Roman" w:cs="Times New Roman"/>
+          <w:sz w:val="28"/>
+          <w:szCs w:val="28"/>
+          <w:lang w:val="en-US"/>
+        </w:rPr>
+      </w:pPr>
+      <w:r>
+        <w:rPr>
+          <w:rFonts w:ascii="Times New Roman" w:hAnsi="Times New Roman" w:cs="Times New Roman"/>
+          <w:sz w:val="28"/>
+          <w:szCs w:val="28"/>
+          <w:lang w:val="en-US"/>
+        </w:rPr>
+        <w:t>IPAddress gateway(192,168,5,1);</w:t>
+      </w:r>
+    </w:p>
+    <w:p>
+      <w:pPr>
+        <w:spacing w:line="360" w:lineRule="auto"/>
+        <w:jc w:val="both"/>
+        <w:rPr>
+          <w:rFonts w:ascii="Times New Roman" w:hAnsi="Times New Roman" w:cs="Times New Roman"/>
+          <w:sz w:val="28"/>
+          <w:szCs w:val="28"/>
+        </w:rPr>
+      </w:pPr>
+      <w:r>
+        <w:rPr>
+          <w:rFonts w:ascii="Times New Roman" w:hAnsi="Times New Roman" w:cs="Times New Roman"/>
+          <w:sz w:val="28"/>
+          <w:szCs w:val="28"/>
+          <w:lang w:val="en-US"/>
+        </w:rPr>
+        <w:lastRenderedPageBreak/>
+        <w:t>IPAddress</w:t>
+      </w:r>
+      <w:r>
+        <w:rPr>
+          <w:rFonts w:ascii="Times New Roman" w:hAnsi="Times New Roman" w:cs="Times New Roman"/>
+          <w:sz w:val="28"/>
+          <w:szCs w:val="28"/>
+        </w:rPr>
+        <w:t xml:space="preserve"> </w:t>
+      </w:r>
+      <w:r>
+        <w:rPr>
+          <w:rFonts w:ascii="Times New Roman" w:hAnsi="Times New Roman" w:cs="Times New Roman"/>
+          <w:sz w:val="28"/>
+          <w:szCs w:val="28"/>
+          <w:lang w:val="en-US"/>
+        </w:rPr>
+        <w:t>subnet</w:t>
+      </w:r>
+      <w:r>
+        <w:rPr>
+          <w:rFonts w:ascii="Times New Roman" w:hAnsi="Times New Roman" w:cs="Times New Roman"/>
+          <w:sz w:val="28"/>
+          <w:szCs w:val="28"/>
+        </w:rPr>
+        <w:t>(255,255,255,0);</w:t>
+      </w:r>
+    </w:p>
+    <w:p>
+      <w:pPr>
+        <w:spacing w:line="360" w:lineRule="auto"/>
+        <w:jc w:val="both"/>
+        <w:rPr>
+          <w:rFonts w:ascii="Times New Roman" w:hAnsi="Times New Roman" w:cs="Times New Roman"/>
+          <w:sz w:val="28"/>
+          <w:szCs w:val="28"/>
+        </w:rPr>
+      </w:pPr>
+      <w:r>
+        <w:rPr>
+          <w:rFonts w:ascii="Times New Roman" w:hAnsi="Times New Roman" w:cs="Times New Roman"/>
+          <w:sz w:val="28"/>
+          <w:szCs w:val="28"/>
+        </w:rPr>
+        <w:t>Параметры</w:t>
+      </w:r>
+      <w:r>
+        <w:rPr>
+          <w:rFonts w:ascii="Times New Roman" w:hAnsi="Times New Roman" w:cs="Times New Roman"/>
+          <w:sz w:val="28"/>
+          <w:szCs w:val="28"/>
+        </w:rPr>
+        <w:t xml:space="preserve"> </w:t>
+      </w:r>
+      <w:r>
+        <w:rPr>
+          <w:rFonts w:ascii="Times New Roman" w:hAnsi="Times New Roman" w:cs="Times New Roman"/>
+          <w:sz w:val="28"/>
+          <w:szCs w:val="28"/>
+        </w:rPr>
+        <w:t xml:space="preserve">настройки модуля включают пять ключевых конфигурационных переменных: </w:t>
+      </w:r>
+      <w:r>
+        <w:rPr>
+          <w:rFonts w:ascii="Times New Roman" w:hAnsi="Times New Roman" w:cs="Times New Roman"/>
+          <w:sz w:val="28"/>
+          <w:szCs w:val="28"/>
+          <w:lang w:val="en-US"/>
+        </w:rPr>
+        <w:t>ssid</w:t>
+      </w:r>
+      <w:r>
+        <w:rPr>
+          <w:rFonts w:ascii="Times New Roman" w:hAnsi="Times New Roman" w:cs="Times New Roman"/>
+          <w:sz w:val="28"/>
+          <w:szCs w:val="28"/>
+        </w:rPr>
+        <w:t>, определяющий имя создаваемой точки доступа (</w:t>
+      </w:r>
+      <w:r>
+        <w:rPr>
+          <w:rFonts w:ascii="Times New Roman" w:hAnsi="Times New Roman" w:cs="Times New Roman"/>
+          <w:sz w:val="28"/>
+          <w:szCs w:val="28"/>
+        </w:rPr>
+        <w:t>Wi-Fi сети</w:t>
+      </w:r>
+      <w:r>
+        <w:rPr>
+          <w:rFonts w:ascii="Times New Roman" w:hAnsi="Times New Roman" w:cs="Times New Roman"/>
+          <w:sz w:val="28"/>
+          <w:szCs w:val="28"/>
+        </w:rPr>
+        <w:t xml:space="preserve">), которое будет отображаться в списке доступных беспроводных сетей; </w:t>
+      </w:r>
+      <w:r>
+        <w:rPr>
+          <w:rFonts w:ascii="Times New Roman" w:hAnsi="Times New Roman" w:cs="Times New Roman"/>
+          <w:sz w:val="28"/>
+          <w:szCs w:val="28"/>
+          <w:lang w:val="en-US"/>
+        </w:rPr>
+        <w:t>pass</w:t>
+      </w:r>
+      <w:r>
+        <w:rPr>
+          <w:rFonts w:ascii="Times New Roman" w:hAnsi="Times New Roman" w:cs="Times New Roman"/>
+          <w:sz w:val="28"/>
+          <w:szCs w:val="28"/>
+        </w:rPr>
+        <w:t xml:space="preserve"> – </w:t>
+      </w:r>
+      <w:r>
+        <w:rPr>
+          <w:rFonts w:ascii="Times New Roman" w:hAnsi="Times New Roman" w:cs="Times New Roman"/>
+          <w:sz w:val="28"/>
+          <w:szCs w:val="28"/>
+        </w:rPr>
+        <w:t xml:space="preserve">пароль для подключения к этой точке доступа; </w:t>
+      </w:r>
+      <w:r>
+        <w:rPr>
+          <w:rFonts w:ascii="Times New Roman" w:hAnsi="Times New Roman" w:cs="Times New Roman"/>
+          <w:sz w:val="28"/>
+          <w:szCs w:val="28"/>
+          <w:lang w:val="en-US"/>
+        </w:rPr>
+        <w:t>local</w:t>
+      </w:r>
+      <w:r>
+        <w:rPr>
+          <w:rFonts w:ascii="Times New Roman" w:hAnsi="Times New Roman" w:cs="Times New Roman"/>
+          <w:sz w:val="28"/>
+          <w:szCs w:val="28"/>
+        </w:rPr>
+        <w:t>_</w:t>
+      </w:r>
+      <w:r>
+        <w:rPr>
+          <w:rFonts w:ascii="Times New Roman" w:hAnsi="Times New Roman" w:cs="Times New Roman"/>
+          <w:sz w:val="28"/>
+          <w:szCs w:val="28"/>
+          <w:lang w:val="en-US"/>
+        </w:rPr>
+        <w:t>ip</w:t>
+      </w:r>
+      <w:r>
+        <w:rPr>
+          <w:rFonts w:ascii="Times New Roman" w:hAnsi="Times New Roman" w:cs="Times New Roman"/>
+          <w:sz w:val="28"/>
+          <w:szCs w:val="28"/>
+        </w:rPr>
+        <w:t xml:space="preserve"> – статический </w:t>
+      </w:r>
+      <w:r>
+        <w:rPr>
+          <w:rFonts w:ascii="Times New Roman" w:hAnsi="Times New Roman" w:cs="Times New Roman"/>
+          <w:sz w:val="28"/>
+          <w:szCs w:val="28"/>
+          <w:lang w:val="en-US"/>
+        </w:rPr>
+        <w:t>IP</w:t>
+      </w:r>
+      <w:r>
+        <w:rPr>
+          <w:rFonts w:ascii="Times New Roman" w:hAnsi="Times New Roman" w:cs="Times New Roman"/>
+          <w:sz w:val="28"/>
+          <w:szCs w:val="28"/>
+        </w:rPr>
+        <w:t>-</w:t>
+      </w:r>
+      <w:r>
+        <w:rPr>
+          <w:rFonts w:ascii="Times New Roman" w:hAnsi="Times New Roman" w:cs="Times New Roman"/>
+          <w:sz w:val="28"/>
+          <w:szCs w:val="28"/>
+        </w:rPr>
+        <w:t xml:space="preserve">адрес, который будет присвоен самому модулю в создаваемой сети; </w:t>
+      </w:r>
+      <w:r>
+        <w:rPr>
+          <w:rFonts w:ascii="Times New Roman" w:hAnsi="Times New Roman" w:cs="Times New Roman"/>
+          <w:sz w:val="28"/>
+          <w:szCs w:val="28"/>
+          <w:lang w:val="en-US"/>
+        </w:rPr>
+        <w:t>gateway</w:t>
+      </w:r>
+      <w:r>
+        <w:rPr>
+          <w:rFonts w:ascii="Times New Roman" w:hAnsi="Times New Roman" w:cs="Times New Roman"/>
+          <w:sz w:val="28"/>
+          <w:szCs w:val="28"/>
+        </w:rPr>
+        <w:t xml:space="preserve"> – адрес сетевого шлюза; </w:t>
+      </w:r>
+      <w:r>
+        <w:rPr>
+          <w:rFonts w:ascii="Times New Roman" w:hAnsi="Times New Roman" w:cs="Times New Roman"/>
+          <w:sz w:val="28"/>
+          <w:szCs w:val="28"/>
+          <w:lang w:val="en-US"/>
+        </w:rPr>
+        <w:t>subnet</w:t>
+      </w:r>
+      <w:r>
+        <w:rPr>
+          <w:rFonts w:ascii="Times New Roman" w:hAnsi="Times New Roman" w:cs="Times New Roman"/>
+          <w:sz w:val="28"/>
+          <w:szCs w:val="28"/>
+        </w:rPr>
+        <w:t xml:space="preserve"> – маска подсети, определяющая структуру локальной сети.</w:t>
+      </w:r>
+    </w:p>
+    <w:p>
+      <w:pPr>
+        <w:pStyle w:val="a7"/>
+        <w:numPr>
+          <w:ilvl w:val="1"/>
+          <w:numId w:val="1"/>
+        </w:numPr>
+        <w:spacing w:line="360" w:lineRule="auto"/>
+        <w:jc w:val="both"/>
+        <w:rPr>
+          <w:rFonts w:ascii="Times New Roman" w:hAnsi="Times New Roman" w:cs="Times New Roman"/>
+          <w:sz w:val="28"/>
+          <w:szCs w:val="28"/>
+        </w:rPr>
+      </w:pPr>
+      <w:r>
+        <w:rPr>
+          <w:rFonts w:ascii="Times New Roman" w:hAnsi="Times New Roman" w:cs="Times New Roman"/>
+          <w:sz w:val="28"/>
+          <w:szCs w:val="28"/>
+        </w:rPr>
+        <w:t>Прошивка</w:t>
+      </w:r>
+    </w:p>
+    <w:p>
+      <w:pPr>
+        <w:spacing w:line="360" w:lineRule="auto"/>
+        <w:jc w:val="both"/>
+        <w:rPr>
+          <w:rFonts w:ascii="Times New Roman" w:hAnsi="Times New Roman" w:cs="Times New Roman"/>
+          <w:sz w:val="28"/>
+          <w:szCs w:val="28"/>
+        </w:rPr>
+      </w:pPr>
+      <w:r>
+        <w:rPr>
+          <w:rFonts w:ascii="Times New Roman" w:hAnsi="Times New Roman" w:cs="Times New Roman"/>
+          <w:sz w:val="28"/>
+          <w:szCs w:val="28"/>
+        </w:rPr>
+        <w:t>Для программирования микроконтроллера ESP8266 необходимо установить интегрированную среду разработки Arduino IDE, доступную для загрузки по указанной ссылке</w:t>
+      </w:r>
+      <w:r>
+        <w:rPr>
+          <w:rFonts w:ascii="Times New Roman" w:hAnsi="Times New Roman" w:cs="Times New Roman"/>
+          <w:sz w:val="28"/>
+          <w:szCs w:val="28"/>
+        </w:rPr>
+        <w:t xml:space="preserve">: </w:t>
+      </w:r>
+      <w:hyperlink r:id="rId5" w:history="1">
+        <w:r>
+          <w:rPr>
+            <w:rStyle w:val="ac"/>
+            <w:rFonts w:ascii="Times New Roman" w:hAnsi="Times New Roman" w:cs="Times New Roman"/>
+            <w:sz w:val="28"/>
+            <w:szCs w:val="28"/>
+          </w:rPr>
+          <w:t>https://amperka.ru/page/arduino-ide?srsltid=AfmBOoqVE2vqA_LFNaxhBhvKlQyiRai_y1d0an_NkZClTNiWrDkwp5RF</w:t>
+        </w:r>
+      </w:hyperlink>
+      <w:r>
+        <w:rPr>
+          <w:rFonts w:ascii="Times New Roman" w:hAnsi="Times New Roman" w:cs="Times New Roman"/>
+          <w:sz w:val="28"/>
+          <w:szCs w:val="28"/>
+        </w:rPr>
+        <w:t>. После инсталляции среды требуется установить специализированные библиотеки ESP Async TCP и ESP Async WebServer через встроенный менеджер библиотек (</w:t>
+      </w:r>
+      <w:r>
+        <w:rPr>
+          <w:rFonts w:ascii="Times New Roman" w:hAnsi="Times New Roman" w:cs="Times New Roman"/>
+          <w:sz w:val="28"/>
+          <w:szCs w:val="28"/>
+        </w:rPr>
+        <w:t>Рисунок 1)</w:t>
+      </w:r>
+      <w:r>
+        <w:rPr>
+          <w:rFonts w:ascii="Times New Roman" w:hAnsi="Times New Roman" w:cs="Times New Roman"/>
+          <w:sz w:val="28"/>
+          <w:szCs w:val="28"/>
+        </w:rPr>
+        <w:t xml:space="preserve">. </w:t>
+      </w:r>
+    </w:p>
+    <w:p>
+      <w:pPr>
+        <w:keepNext/>
+        <w:spacing w:line="360" w:lineRule="auto"/>
+        <w:jc w:val="center"/>
+      </w:pPr>
+      <w:r>
+        <w:rPr>
+          <w:noProof/>
+        </w:rPr>
+        <w:drawing>
+          <wp:inline distT="0" distB="0" distL="0" distR="0" wp14:anchorId="144DC3B4" wp14:editId="043C94F7">
+            <wp:extent cx="2391955" cy="3084624"/>
+            <wp:effectExtent l="0" t="0" r="8890" b="1905"/>
+            <wp:docPr id="1076316631" name="Рисунок 1"/>
+            <wp:cNvGraphicFramePr>
+              <a:graphicFrameLocks xmlns:a="http://schemas.openxmlformats.org/drawingml/2006/main" noChangeAspect="1"/>
+            </wp:cNvGraphicFramePr>
+            <a:graphic xmlns:a="http://schemas.openxmlformats.org/drawingml/2006/main">
+              <a:graphicData uri="http://schemas.openxmlformats.org/drawingml/2006/picture">
+                <pic:pic xmlns:pic="http://schemas.openxmlformats.org/drawingml/2006/picture">
+                  <pic:nvPicPr>
+                    <pic:cNvPr id="1076316631" name=""/>
+                    <pic:cNvPicPr/>
+                  </pic:nvPicPr>
+                  <pic:blipFill>
+                    <a:blip r:embed="rId6"/>
+                    <a:stretch>
+                      <a:fillRect/>
+                    </a:stretch>
+                  </pic:blipFill>
+                  <pic:spPr>
+                    <a:xfrm>
+                      <a:off x="0" y="0"/>
+                      <a:ext cx="2423279" cy="3125019"/>
+                    </a:xfrm>
+                    <a:prstGeom prst="rect">
+                      <a:avLst/>
+                    </a:prstGeom>
+                  </pic:spPr>
+                </pic:pic>
+              </a:graphicData>
+            </a:graphic>
+          </wp:inline>
+        </w:drawing>
+      </w:r>
+    </w:p>
+    <w:p>
+      <w:pPr>
+        <w:pStyle w:val="af"/>
+        <w:jc w:val="center"/>
+        <w:rPr>
+          <w:rFonts w:ascii="Times New Roman" w:hAnsi="Times New Roman" w:cs="Times New Roman"/>
+          <w:i w:val="0"/>
+          <w:iCs w:val="0"/>
+          <w:color w:val="auto"/>
+          <w:sz w:val="24"/>
+          <w:szCs w:val="24"/>
+        </w:rPr>
+      </w:pPr>
+      <w:r>
+        <w:rPr>
+          <w:rFonts w:ascii="Times New Roman" w:hAnsi="Times New Roman" w:cs="Times New Roman"/>
+          <w:i w:val="0"/>
+          <w:iCs w:val="0"/>
+          <w:color w:val="auto"/>
+          <w:sz w:val="24"/>
+          <w:szCs w:val="24"/>
+        </w:rPr>
+        <w:t xml:space="preserve">Рисунок </w:t>
+      </w:r>
+      <w:r>
+        <w:rPr>
+          <w:rFonts w:ascii="Times New Roman" w:hAnsi="Times New Roman" w:cs="Times New Roman"/>
+          <w:i w:val="0"/>
+          <w:iCs w:val="0"/>
+          <w:color w:val="auto"/>
+          <w:sz w:val="24"/>
+          <w:szCs w:val="24"/>
+        </w:rPr>
+        <w:fldChar w:fldCharType="begin"/>
+      </w:r>
+      <w:r>
+        <w:rPr>
+          <w:rFonts w:ascii="Times New Roman" w:hAnsi="Times New Roman" w:cs="Times New Roman"/>
+          <w:i w:val="0"/>
+          <w:iCs w:val="0"/>
+          <w:color w:val="auto"/>
+          <w:sz w:val="24"/>
+          <w:szCs w:val="24"/>
+        </w:rPr>
+        <w:instrText xml:space="preserve"> SEQ Рисунок \* ARABIC </w:instrText>
+      </w:r>
+      <w:r>
+        <w:rPr>
+          <w:rFonts w:ascii="Times New Roman" w:hAnsi="Times New Roman" w:cs="Times New Roman"/>
+          <w:i w:val="0"/>
+          <w:iCs w:val="0"/>
+          <w:color w:val="auto"/>
+          <w:sz w:val="24"/>
+          <w:szCs w:val="24"/>
+        </w:rPr>
+        <w:fldChar w:fldCharType="separate"/>
+      </w:r>
+      <w:r>
+        <w:rPr>
+          <w:rFonts w:ascii="Times New Roman" w:hAnsi="Times New Roman" w:cs="Times New Roman"/>
+          <w:i w:val="0"/>
+          <w:iCs w:val="0"/>
+          <w:noProof/>
+          <w:color w:val="auto"/>
+          <w:sz w:val="24"/>
+          <w:szCs w:val="24"/>
+        </w:rPr>
+        <w:t>1</w:t>
+      </w:r>
+      <w:r>
+        <w:rPr>
+          <w:rFonts w:ascii="Times New Roman" w:hAnsi="Times New Roman" w:cs="Times New Roman"/>
+          <w:i w:val="0"/>
+          <w:iCs w:val="0"/>
+          <w:color w:val="auto"/>
+          <w:sz w:val="24"/>
+          <w:szCs w:val="24"/>
+        </w:rPr>
+        <w:fldChar w:fldCharType="end"/>
+      </w:r>
+      <w:r>
+        <w:rPr>
+          <w:rFonts w:ascii="Times New Roman" w:hAnsi="Times New Roman" w:cs="Times New Roman"/>
+          <w:i w:val="0"/>
+          <w:iCs w:val="0"/>
+          <w:color w:val="auto"/>
+          <w:sz w:val="24"/>
+          <w:szCs w:val="24"/>
+        </w:rPr>
+        <w:t xml:space="preserve"> – </w:t>
+      </w:r>
+      <w:r>
+        <w:rPr>
+          <w:rFonts w:ascii="Times New Roman" w:hAnsi="Times New Roman" w:cs="Times New Roman"/>
+          <w:i w:val="0"/>
+          <w:iCs w:val="0"/>
+          <w:color w:val="auto"/>
+          <w:sz w:val="24"/>
+          <w:szCs w:val="24"/>
+        </w:rPr>
+        <w:t>Установка</w:t>
+      </w:r>
+      <w:r>
+        <w:rPr>
+          <w:rFonts w:ascii="Times New Roman" w:hAnsi="Times New Roman" w:cs="Times New Roman"/>
+          <w:i w:val="0"/>
+          <w:iCs w:val="0"/>
+          <w:color w:val="auto"/>
+          <w:sz w:val="24"/>
+          <w:szCs w:val="24"/>
+        </w:rPr>
+        <w:t xml:space="preserve"> библиотек</w:t>
+      </w:r>
+    </w:p>
+    <w:p>
+      <w:pPr>
+        <w:spacing w:line="360" w:lineRule="auto"/>
+        <w:jc w:val="both"/>
+        <w:rPr>
+          <w:rFonts w:ascii="Times New Roman" w:hAnsi="Times New Roman" w:cs="Times New Roman"/>
+          <w:sz w:val="28"/>
+          <w:szCs w:val="28"/>
+        </w:rPr>
+      </w:pPr>
+      <w:r>
+        <w:rPr>
+          <w:rFonts w:ascii="Times New Roman" w:hAnsi="Times New Roman" w:cs="Times New Roman"/>
+          <w:sz w:val="28"/>
+          <w:szCs w:val="28"/>
+        </w:rPr>
+        <w:lastRenderedPageBreak/>
+        <w:t>Далее</w:t>
+      </w:r>
+      <w:r>
+        <w:rPr>
+          <w:rFonts w:ascii="Times New Roman" w:hAnsi="Times New Roman" w:cs="Times New Roman"/>
+          <w:sz w:val="28"/>
+          <w:szCs w:val="28"/>
+        </w:rPr>
+        <w:t xml:space="preserve"> </w:t>
+      </w:r>
+      <w:r>
+        <w:rPr>
+          <w:rFonts w:ascii="Times New Roman" w:hAnsi="Times New Roman" w:cs="Times New Roman"/>
+          <w:sz w:val="28"/>
+          <w:szCs w:val="28"/>
+        </w:rPr>
+        <w:t>выполняется настройка поддержки платформы ESP8266 в среде Arduino IDE следуя инструкции с сайта</w:t>
+      </w:r>
+      <w:r>
+        <w:rPr>
+          <w:rFonts w:ascii="Times New Roman" w:hAnsi="Times New Roman" w:cs="Times New Roman"/>
+          <w:sz w:val="28"/>
+          <w:szCs w:val="28"/>
+        </w:rPr>
+        <w:t>:</w:t>
+      </w:r>
+      <w:r>
+        <w:rPr>
+          <w:rFonts w:ascii="Times New Roman" w:hAnsi="Times New Roman" w:cs="Times New Roman"/>
+          <w:sz w:val="28"/>
+          <w:szCs w:val="28"/>
+        </w:rPr>
+        <w:t xml:space="preserve"> </w:t>
+      </w:r>
+      <w:hyperlink r:id="rId7" w:anchor="using-git-version" w:history="1">
+        <w:r>
+          <w:rPr>
+            <w:rStyle w:val="ac"/>
+            <w:rFonts w:ascii="Times New Roman" w:hAnsi="Times New Roman" w:cs="Times New Roman"/>
+            <w:sz w:val="28"/>
+            <w:szCs w:val="28"/>
+          </w:rPr>
+          <w:t>https://arduino-esp8266.readthedocs.io/en/latest/installing.html#using-git-version</w:t>
+        </w:r>
+      </w:hyperlink>
+      <w:r>
+        <w:rPr>
+          <w:rFonts w:ascii="Times New Roman" w:hAnsi="Times New Roman" w:cs="Times New Roman"/>
+          <w:sz w:val="28"/>
+          <w:szCs w:val="28"/>
+        </w:rPr>
+        <w:t>.</w:t>
+      </w:r>
+      <w:r>
+        <w:rPr>
+          <w:rFonts w:ascii="Times New Roman" w:hAnsi="Times New Roman" w:cs="Times New Roman"/>
+          <w:sz w:val="28"/>
+          <w:szCs w:val="28"/>
+        </w:rPr>
+        <w:t xml:space="preserve"> </w:t>
+      </w:r>
+      <w:r>
+        <w:rPr>
+          <w:rFonts w:ascii="Times New Roman" w:hAnsi="Times New Roman" w:cs="Times New Roman"/>
+          <w:sz w:val="28"/>
+          <w:szCs w:val="28"/>
+        </w:rPr>
+        <w:t>Данный программный пакет реализует полную поддержку микросхемы ESP8266 в экосистеме Arduino, предоставляя возможность разработки скетчей с использованием стандартного Arduino API и их непосредственного исполнения на ESP8266 без необходимости применения внешнего микроконтроллера. Ядро ESP8266 Arduino включает комплекс библиотек для сетевого взаимодействия по Wi-Fi с поддержкой протоколов TCP и UDP, развёртывания серверов HTTP, mDNS, SSDP и DNS, работы с файловой системой во флеш-памяти, а также управления периферийными устройствами через интерфейсы SPI, I2C и работу с SD-картами.</w:t>
+      </w:r>
+    </w:p>
+    <w:p>
+      <w:pPr>
+        <w:spacing w:line="360" w:lineRule="auto"/>
+        <w:jc w:val="both"/>
+        <w:rPr>
+          <w:rFonts w:ascii="Times New Roman" w:hAnsi="Times New Roman" w:cs="Times New Roman"/>
+          <w:sz w:val="28"/>
+          <w:szCs w:val="28"/>
+        </w:rPr>
+      </w:pPr>
+      <w:r>
+        <w:rPr>
+          <w:rFonts w:ascii="Times New Roman" w:hAnsi="Times New Roman" w:cs="Times New Roman"/>
+          <w:sz w:val="28"/>
+          <w:szCs w:val="28"/>
+        </w:rPr>
+        <w:t xml:space="preserve">После успешной настройки программной среды осуществляется физическое подключение модуля ESP8266 к компьютеру через USB-кабель, поддерживающий передачу данных (не только питание). В операционной системе определяется назначенный COM-порт устройства </w:t>
+      </w:r>
+      <w:r>
+        <w:rPr>
+          <w:rFonts w:ascii="Times New Roman" w:hAnsi="Times New Roman" w:cs="Times New Roman"/>
+          <w:sz w:val="28"/>
+          <w:szCs w:val="28"/>
+        </w:rPr>
+        <w:t>через диспетчера</w:t>
+      </w:r>
+      <w:r>
+        <w:rPr>
+          <w:rFonts w:ascii="Times New Roman" w:hAnsi="Times New Roman" w:cs="Times New Roman"/>
+          <w:sz w:val="28"/>
+          <w:szCs w:val="28"/>
+        </w:rPr>
+        <w:t xml:space="preserve"> устройств в разделе "Порты (COM и LPT)". В среде Arduino IDE выполняется открытие исходного файла прошивки (esp8266.ino), выбор целевой платформы в меню Tools → Board → ESP8266 Boards </w:t>
+      </w:r>
+      <w:r>
+        <w:rPr>
+          <w:rFonts w:ascii="Times New Roman" w:hAnsi="Times New Roman" w:cs="Times New Roman"/>
+          <w:sz w:val="28"/>
+          <w:szCs w:val="28"/>
+        </w:rPr>
+        <w:t>→</w:t>
+      </w:r>
+      <w:r>
+        <w:rPr>
+          <w:rFonts w:ascii="Times New Roman" w:hAnsi="Times New Roman" w:cs="Times New Roman"/>
+          <w:sz w:val="28"/>
+          <w:szCs w:val="28"/>
+        </w:rPr>
+        <w:t xml:space="preserve"> </w:t>
+      </w:r>
+      <w:r>
+        <w:rPr>
+          <w:rFonts w:ascii="Times New Roman" w:hAnsi="Times New Roman" w:cs="Times New Roman"/>
+          <w:sz w:val="28"/>
+          <w:szCs w:val="28"/>
+          <w:lang w:val="en-US"/>
+        </w:rPr>
+        <w:t>LOLIN</w:t>
+      </w:r>
+      <w:r>
+        <w:rPr>
+          <w:rFonts w:ascii="Times New Roman" w:hAnsi="Times New Roman" w:cs="Times New Roman"/>
+          <w:sz w:val="28"/>
+          <w:szCs w:val="28"/>
+        </w:rPr>
+        <w:t>(</w:t>
+      </w:r>
+      <w:r>
+        <w:rPr>
+          <w:rFonts w:ascii="Times New Roman" w:hAnsi="Times New Roman" w:cs="Times New Roman"/>
+          <w:sz w:val="28"/>
+          <w:szCs w:val="28"/>
+          <w:lang w:val="en-US"/>
+        </w:rPr>
+        <w:t>WEMOS</w:t>
+      </w:r>
+      <w:r>
+        <w:rPr>
+          <w:rFonts w:ascii="Times New Roman" w:hAnsi="Times New Roman" w:cs="Times New Roman"/>
+          <w:sz w:val="28"/>
+          <w:szCs w:val="28"/>
+        </w:rPr>
+        <w:t xml:space="preserve">) </w:t>
+      </w:r>
+      <w:r>
+        <w:rPr>
+          <w:rFonts w:ascii="Times New Roman" w:hAnsi="Times New Roman" w:cs="Times New Roman"/>
+          <w:sz w:val="28"/>
+          <w:szCs w:val="28"/>
+          <w:lang w:val="en-US"/>
+        </w:rPr>
+        <w:t>D</w:t>
+      </w:r>
+      <w:r>
+        <w:rPr>
+          <w:rFonts w:ascii="Times New Roman" w:hAnsi="Times New Roman" w:cs="Times New Roman"/>
+          <w:sz w:val="28"/>
+          <w:szCs w:val="28"/>
+        </w:rPr>
+        <w:t xml:space="preserve">1 </w:t>
+      </w:r>
+      <w:r>
+        <w:rPr>
+          <w:rFonts w:ascii="Times New Roman" w:hAnsi="Times New Roman" w:cs="Times New Roman"/>
+          <w:sz w:val="28"/>
+          <w:szCs w:val="28"/>
+          <w:lang w:val="en-US"/>
+        </w:rPr>
+        <w:t>mini</w:t>
+      </w:r>
+      <w:r>
+        <w:rPr>
+          <w:rFonts w:ascii="Times New Roman" w:hAnsi="Times New Roman" w:cs="Times New Roman"/>
+          <w:sz w:val="28"/>
+          <w:szCs w:val="28"/>
+        </w:rPr>
+        <w:t xml:space="preserve"> (</w:t>
+      </w:r>
+      <w:r>
+        <w:rPr>
+          <w:rFonts w:ascii="Times New Roman" w:hAnsi="Times New Roman" w:cs="Times New Roman"/>
+          <w:sz w:val="28"/>
+          <w:szCs w:val="28"/>
+          <w:lang w:val="en-US"/>
+        </w:rPr>
+        <w:t>clone</w:t>
+      </w:r>
+      <w:r>
+        <w:rPr>
+          <w:rFonts w:ascii="Times New Roman" w:hAnsi="Times New Roman" w:cs="Times New Roman"/>
+          <w:sz w:val="28"/>
+          <w:szCs w:val="28"/>
+        </w:rPr>
+        <w:t>)</w:t>
+      </w:r>
+      <w:r>
+        <w:rPr>
+          <w:rFonts w:ascii="Times New Roman" w:hAnsi="Times New Roman" w:cs="Times New Roman"/>
+          <w:sz w:val="28"/>
+          <w:szCs w:val="28"/>
+        </w:rPr>
+        <w:t xml:space="preserve"> (Рисунок 2) </w:t>
+      </w:r>
+      <w:r>
+        <w:rPr>
+          <w:rFonts w:ascii="Times New Roman" w:hAnsi="Times New Roman" w:cs="Times New Roman"/>
+          <w:sz w:val="28"/>
+          <w:szCs w:val="28"/>
+        </w:rPr>
+        <w:t>и установка соответствующего COM-порта в меню Tools → Port</w:t>
+      </w:r>
+      <w:r>
+        <w:rPr>
+          <w:rFonts w:ascii="Times New Roman" w:hAnsi="Times New Roman" w:cs="Times New Roman"/>
+          <w:sz w:val="28"/>
+          <w:szCs w:val="28"/>
+        </w:rPr>
+        <w:t xml:space="preserve"> (Рисунок 3)</w:t>
+      </w:r>
+      <w:r>
+        <w:rPr>
+          <w:rFonts w:ascii="Times New Roman" w:hAnsi="Times New Roman" w:cs="Times New Roman"/>
+          <w:sz w:val="28"/>
+          <w:szCs w:val="28"/>
+        </w:rPr>
+        <w:t xml:space="preserve">. </w:t>
+      </w:r>
+      <w:r>
+        <w:rPr>
+          <w:rFonts w:ascii="Times New Roman" w:hAnsi="Times New Roman" w:cs="Times New Roman"/>
+          <w:sz w:val="28"/>
+          <w:szCs w:val="28"/>
+        </w:rPr>
+        <w:t>После выполнения данных конфигурационных шагов становится доступна процедура компиляции и загрузки прошивки на целевое устройство.</w:t>
+      </w:r>
+      <w:r>
+        <w:rPr>
+          <w:rFonts w:ascii="Times New Roman" w:hAnsi="Times New Roman" w:cs="Times New Roman"/>
+          <w:sz w:val="28"/>
+          <w:szCs w:val="28"/>
+        </w:rPr>
+        <w:t xml:space="preserve"> Для прошивки модуля нажать на кнопку </w:t>
+      </w:r>
+      <w:r>
+        <w:rPr>
+          <w:rFonts w:ascii="Times New Roman" w:hAnsi="Times New Roman" w:cs="Times New Roman"/>
+          <w:sz w:val="28"/>
+          <w:szCs w:val="28"/>
+        </w:rPr>
+        <w:t>Upload (→)</w:t>
+      </w:r>
+      <w:r>
+        <w:rPr>
+          <w:rFonts w:ascii="Times New Roman" w:hAnsi="Times New Roman" w:cs="Times New Roman"/>
+          <w:sz w:val="28"/>
+          <w:szCs w:val="28"/>
+        </w:rPr>
+        <w:t>.</w:t>
+      </w:r>
+    </w:p>
+    <w:p>
+      <w:pPr>
+        <w:spacing w:line="360" w:lineRule="auto"/>
+        <w:rPr>
+          <w:rFonts w:ascii="Times New Roman" w:hAnsi="Times New Roman" w:cs="Times New Roman"/>
+          <w:sz w:val="28"/>
+          <w:szCs w:val="28"/>
+        </w:rPr>
+      </w:pPr>
+    </w:p>
+    <w:p>
+      <w:pPr>
+        <w:spacing w:line="360" w:lineRule="auto"/>
+        <w:jc w:val="both"/>
+        <w:rPr>
+          <w:rFonts w:ascii="Times New Roman" w:hAnsi="Times New Roman" w:cs="Times New Roman"/>
+          <w:sz w:val="28"/>
+          <w:szCs w:val="28"/>
+        </w:rPr>
+      </w:pPr>
+    </w:p>
+    <w:p>
+      <w:pPr>
+        <w:spacing w:line="360" w:lineRule="auto"/>
+        <w:jc w:val="both"/>
+      </w:pPr>
+      <w:r>
+        <w:rPr>
+          <w:noProof/>
+        </w:rPr>
+        <w:lastRenderedPageBreak/>
+        <w:drawing>
+          <wp:inline distT="0" distB="0" distL="0" distR="0" wp14:anchorId="48C79DCA" wp14:editId="2830F5F8">
+            <wp:extent cx="6195060" cy="3286593"/>
+            <wp:effectExtent l="0" t="0" r="0" b="9525"/>
+            <wp:docPr id="2117121805" name="Рисунок 1"/>
+            <wp:cNvGraphicFramePr>
+              <a:graphicFrameLocks xmlns:a="http://schemas.openxmlformats.org/drawingml/2006/main" noChangeAspect="1"/>
+            </wp:cNvGraphicFramePr>
+            <a:graphic xmlns:a="http://schemas.openxmlformats.org/drawingml/2006/main">
+              <a:graphicData uri="http://schemas.openxmlformats.org/drawingml/2006/picture">
+                <pic:pic xmlns:pic="http://schemas.openxmlformats.org/drawingml/2006/picture">
+                  <pic:nvPicPr>
+                    <pic:cNvPr id="2117121805" name=""/>
+                    <pic:cNvPicPr/>
+                  </pic:nvPicPr>
+                  <pic:blipFill>
+                    <a:blip r:embed="rId8"/>
+                    <a:stretch>
+                      <a:fillRect/>
+                    </a:stretch>
+                  </pic:blipFill>
+                  <pic:spPr>
+                    <a:xfrm>
+                      <a:off x="0" y="0"/>
+                      <a:ext cx="6216369" cy="3297898"/>
+                    </a:xfrm>
+                    <a:prstGeom prst="rect">
+                      <a:avLst/>
+                    </a:prstGeom>
+                  </pic:spPr>
+                </pic:pic>
+              </a:graphicData>
+            </a:graphic>
+          </wp:inline>
+        </w:drawing>
+      </w:r>
+    </w:p>
+    <w:p>
+      <w:pPr>
+        <w:pStyle w:val="af"/>
+        <w:jc w:val="center"/>
+        <w:rPr>
+          <w:rFonts w:ascii="Times New Roman" w:hAnsi="Times New Roman" w:cs="Times New Roman"/>
+          <w:i w:val="0"/>
+          <w:iCs w:val="0"/>
+          <w:color w:val="auto"/>
+          <w:sz w:val="24"/>
+          <w:szCs w:val="24"/>
+        </w:rPr>
+      </w:pPr>
+      <w:r>
+        <w:rPr>
+          <w:rFonts w:ascii="Times New Roman" w:hAnsi="Times New Roman" w:cs="Times New Roman"/>
+          <w:i w:val="0"/>
+          <w:iCs w:val="0"/>
+          <w:color w:val="auto"/>
+          <w:sz w:val="24"/>
+          <w:szCs w:val="24"/>
+        </w:rPr>
+        <w:t xml:space="preserve">Рисунок </w:t>
+      </w:r>
+      <w:r>
+        <w:rPr>
+          <w:rFonts w:ascii="Times New Roman" w:hAnsi="Times New Roman" w:cs="Times New Roman"/>
+          <w:i w:val="0"/>
+          <w:iCs w:val="0"/>
+          <w:color w:val="auto"/>
+          <w:sz w:val="24"/>
+          <w:szCs w:val="24"/>
+        </w:rPr>
+        <w:fldChar w:fldCharType="begin"/>
+      </w:r>
+      <w:r>
+        <w:rPr>
+          <w:rFonts w:ascii="Times New Roman" w:hAnsi="Times New Roman" w:cs="Times New Roman"/>
+          <w:i w:val="0"/>
+          <w:iCs w:val="0"/>
+          <w:color w:val="auto"/>
+          <w:sz w:val="24"/>
+          <w:szCs w:val="24"/>
+        </w:rPr>
+        <w:instrText xml:space="preserve"> SEQ Рисунок \* ARABIC </w:instrText>
+      </w:r>
+      <w:r>
+        <w:rPr>
+          <w:rFonts w:ascii="Times New Roman" w:hAnsi="Times New Roman" w:cs="Times New Roman"/>
+          <w:i w:val="0"/>
+          <w:iCs w:val="0"/>
+          <w:color w:val="auto"/>
+          <w:sz w:val="24"/>
+          <w:szCs w:val="24"/>
+        </w:rPr>
+        <w:fldChar w:fldCharType="separate"/>
+      </w:r>
+      <w:r>
+        <w:rPr>
+          <w:rFonts w:ascii="Times New Roman" w:hAnsi="Times New Roman" w:cs="Times New Roman"/>
+          <w:i w:val="0"/>
+          <w:iCs w:val="0"/>
+          <w:noProof/>
+          <w:color w:val="auto"/>
+          <w:sz w:val="24"/>
+          <w:szCs w:val="24"/>
+        </w:rPr>
+        <w:t>2</w:t>
+      </w:r>
+      <w:r>
+        <w:rPr>
+          <w:rFonts w:ascii="Times New Roman" w:hAnsi="Times New Roman" w:cs="Times New Roman"/>
+          <w:i w:val="0"/>
+          <w:iCs w:val="0"/>
+          <w:color w:val="auto"/>
+          <w:sz w:val="24"/>
+          <w:szCs w:val="24"/>
+        </w:rPr>
+        <w:fldChar w:fldCharType="end"/>
+      </w:r>
+      <w:r>
+        <w:rPr>
+          <w:rFonts w:ascii="Times New Roman" w:hAnsi="Times New Roman" w:cs="Times New Roman"/>
+          <w:i w:val="0"/>
+          <w:iCs w:val="0"/>
+          <w:color w:val="auto"/>
+          <w:sz w:val="24"/>
+          <w:szCs w:val="24"/>
+        </w:rPr>
+        <w:t xml:space="preserve"> – Выбор целевой платформы</w:t>
+      </w:r>
+    </w:p>
+    <w:p>
+      <w:pPr>
+        <w:spacing w:line="360" w:lineRule="auto"/>
+        <w:jc w:val="both"/>
+        <w:rPr>
+          <w:rFonts w:ascii="Times New Roman" w:hAnsi="Times New Roman" w:cs="Times New Roman"/>
+          <w:sz w:val="28"/>
+          <w:szCs w:val="28"/>
+        </w:rPr>
+      </w:pPr>
+    </w:p>
+    <w:p>
+      <w:pPr>
+        <w:spacing w:line="360" w:lineRule="auto"/>
+        <w:jc w:val="both"/>
+        <w:rPr>
+          <w:noProof/>
+        </w:rPr>
+      </w:pPr>
+    </w:p>
+    <w:p>
+      <w:pPr>
+        <w:keepNext/>
+        <w:spacing w:line="360" w:lineRule="auto"/>
+        <w:jc w:val="center"/>
+      </w:pPr>
+      <w:r>
+        <w:rPr>
+          <w:noProof/>
+        </w:rPr>
+        <w:drawing>
+          <wp:inline distT="0" distB="0" distL="0" distR="0" wp14:anchorId="0B44CBB7" wp14:editId="785ADDFB">
+            <wp:extent cx="4911725" cy="3080920"/>
+            <wp:effectExtent l="0" t="0" r="3175" b="5715"/>
+            <wp:docPr id="841568599" name="Рисунок 1"/>
+            <wp:cNvGraphicFramePr>
+              <a:graphicFrameLocks xmlns:a="http://schemas.openxmlformats.org/drawingml/2006/main" noChangeAspect="1"/>
+            </wp:cNvGraphicFramePr>
+            <a:graphic xmlns:a="http://schemas.openxmlformats.org/drawingml/2006/main">
+              <a:graphicData uri="http://schemas.openxmlformats.org/drawingml/2006/picture">
+                <pic:pic xmlns:pic="http://schemas.openxmlformats.org/drawingml/2006/picture">
+                  <pic:nvPicPr>
+                    <pic:cNvPr id="841568599" name=""/>
+                    <pic:cNvPicPr/>
+                  </pic:nvPicPr>
+                  <pic:blipFill rotWithShape="1">
+                    <a:blip r:embed="rId9"/>
+                    <a:srcRect b="48845"/>
+                    <a:stretch>
+                      <a:fillRect/>
+                    </a:stretch>
+                  </pic:blipFill>
+                  <pic:spPr bwMode="auto">
+                    <a:xfrm>
+                      <a:off x="0" y="0"/>
+                      <a:ext cx="4916139" cy="3083688"/>
+                    </a:xfrm>
+                    <a:prstGeom prst="rect">
+                      <a:avLst/>
+                    </a:prstGeom>
+                    <a:ln>
+                      <a:noFill/>
+                    </a:ln>
+                    <a:extLst>
+                      <a:ext uri="{53640926-AAD7-44D8-BBD7-CCE9431645EC}">
+                        <a14:shadowObscured xmlns:a14="http://schemas.microsoft.com/office/drawing/2010/main"/>
+                      </a:ext>
+                    </a:extLst>
+                  </pic:spPr>
+                </pic:pic>
+              </a:graphicData>
+            </a:graphic>
+          </wp:inline>
+        </w:drawing>
+      </w:r>
+    </w:p>
+    <w:p>
+      <w:pPr>
+        <w:pStyle w:val="af"/>
+        <w:jc w:val="center"/>
+        <w:rPr>
+          <w:rFonts w:ascii="Times New Roman" w:hAnsi="Times New Roman" w:cs="Times New Roman"/>
+          <w:i w:val="0"/>
+          <w:iCs w:val="0"/>
+          <w:sz w:val="24"/>
+          <w:szCs w:val="24"/>
+        </w:rPr>
+      </w:pPr>
+      <w:r>
+        <w:rPr>
+          <w:rFonts w:ascii="Times New Roman" w:hAnsi="Times New Roman" w:cs="Times New Roman"/>
+          <w:i w:val="0"/>
+          <w:iCs w:val="0"/>
+          <w:color w:val="auto"/>
+          <w:sz w:val="24"/>
+          <w:szCs w:val="24"/>
+        </w:rPr>
+        <w:t xml:space="preserve">Рисунок </w:t>
+      </w:r>
+      <w:r>
+        <w:rPr>
+          <w:rFonts w:ascii="Times New Roman" w:hAnsi="Times New Roman" w:cs="Times New Roman"/>
+          <w:i w:val="0"/>
+          <w:iCs w:val="0"/>
+          <w:color w:val="auto"/>
+          <w:sz w:val="24"/>
+          <w:szCs w:val="24"/>
+        </w:rPr>
+        <w:fldChar w:fldCharType="begin"/>
+      </w:r>
+      <w:r>
+        <w:rPr>
+          <w:rFonts w:ascii="Times New Roman" w:hAnsi="Times New Roman" w:cs="Times New Roman"/>
+          <w:i w:val="0"/>
+          <w:iCs w:val="0"/>
+          <w:color w:val="auto"/>
+          <w:sz w:val="24"/>
+          <w:szCs w:val="24"/>
+        </w:rPr>
+        <w:instrText xml:space="preserve"> SEQ Рисунок \* ARABIC </w:instrText>
+      </w:r>
+      <w:r>
+        <w:rPr>
+          <w:rFonts w:ascii="Times New Roman" w:hAnsi="Times New Roman" w:cs="Times New Roman"/>
+          <w:i w:val="0"/>
+          <w:iCs w:val="0"/>
+          <w:color w:val="auto"/>
+          <w:sz w:val="24"/>
+          <w:szCs w:val="24"/>
+        </w:rPr>
+        <w:fldChar w:fldCharType="separate"/>
+      </w:r>
+      <w:r>
+        <w:rPr>
+          <w:rFonts w:ascii="Times New Roman" w:hAnsi="Times New Roman" w:cs="Times New Roman"/>
+          <w:i w:val="0"/>
+          <w:iCs w:val="0"/>
+          <w:noProof/>
+          <w:color w:val="auto"/>
+          <w:sz w:val="24"/>
+          <w:szCs w:val="24"/>
+        </w:rPr>
+        <w:t>3</w:t>
+      </w:r>
+      <w:r>
+        <w:rPr>
+          <w:rFonts w:ascii="Times New Roman" w:hAnsi="Times New Roman" w:cs="Times New Roman"/>
+          <w:i w:val="0"/>
+          <w:iCs w:val="0"/>
+          <w:color w:val="auto"/>
+          <w:sz w:val="24"/>
+          <w:szCs w:val="24"/>
+        </w:rPr>
+        <w:fldChar w:fldCharType="end"/>
+      </w:r>
+      <w:r>
+        <w:rPr>
+          <w:rFonts w:ascii="Times New Roman" w:hAnsi="Times New Roman" w:cs="Times New Roman"/>
+          <w:i w:val="0"/>
+          <w:iCs w:val="0"/>
+          <w:color w:val="auto"/>
+          <w:sz w:val="24"/>
+          <w:szCs w:val="24"/>
+        </w:rPr>
+        <w:t xml:space="preserve"> – Выбор </w:t>
+      </w:r>
+      <w:r>
+        <w:rPr>
+          <w:rFonts w:ascii="Times New Roman" w:hAnsi="Times New Roman" w:cs="Times New Roman"/>
+          <w:i w:val="0"/>
+          <w:iCs w:val="0"/>
+          <w:color w:val="auto"/>
+          <w:sz w:val="24"/>
+          <w:szCs w:val="24"/>
+          <w:lang w:val="en-US"/>
+        </w:rPr>
+        <w:t>COM</w:t>
+      </w:r>
+      <w:r>
+        <w:rPr>
+          <w:rFonts w:ascii="Times New Roman" w:hAnsi="Times New Roman" w:cs="Times New Roman"/>
+          <w:i w:val="0"/>
+          <w:iCs w:val="0"/>
+          <w:color w:val="auto"/>
+          <w:sz w:val="24"/>
+          <w:szCs w:val="24"/>
+        </w:rPr>
+        <w:t>-порта</w:t>
+      </w:r>
+    </w:p>
+    <w:p>
+      <w:pPr>
+        <w:spacing w:line="360" w:lineRule="auto"/>
+        <w:jc w:val="both"/>
+        <w:rPr>
+          <w:rFonts w:ascii="Times New Roman" w:hAnsi="Times New Roman" w:cs="Times New Roman"/>
+          <w:sz w:val="28"/>
+          <w:szCs w:val="28"/>
+        </w:rPr>
+      </w:pPr>
+    </w:p>
+    <w:p>
+      <w:pPr>
+        <w:spacing w:line="360" w:lineRule="auto"/>
+        <w:jc w:val="both"/>
         <w:rPr>
           <w:rFonts w:ascii="Times New Roman" w:hAnsi="Times New Roman" w:cs="Times New Roman"/>
           <w:sz w:val="28"/>
@@ -1707,6 +3090,155 @@
     </w:lvl>
   </w:abstractNum>
   <w:abstractNum w:abstractNumId="2" w15:restartNumberingAfterBreak="0">
+    <w:nsid w:val="70EB2598"/>
+    <w:multiLevelType w:val="multilevel"/>
+    <w:tmpl w:val="FDF438AA"/>
+    <w:lvl w:ilvl="0">
+      <w:start w:val="1"/>
+      <w:numFmt w:val="bullet"/>
+      <w:lvlText w:val=""/>
+      <w:lvlJc w:val="left"/>
+      <w:pPr>
+        <w:tabs>
+          <w:tab w:val="num" w:pos="720"/>
+        </w:tabs>
+        <w:ind w:left="720" w:hanging="360"/>
+      </w:pPr>
+      <w:rPr>
+        <w:rFonts w:ascii="Symbol" w:hAnsi="Symbol" w:hint="default"/>
+        <w:sz w:val="20"/>
+      </w:rPr>
+    </w:lvl>
+    <w:lvl w:ilvl="1" w:tentative="1">
+      <w:start w:val="1"/>
+      <w:numFmt w:val="bullet"/>
+      <w:lvlText w:val="o"/>
+      <w:lvlJc w:val="left"/>
+      <w:pPr>
+        <w:tabs>
+          <w:tab w:val="num" w:pos="1440"/>
+        </w:tabs>
+        <w:ind w:left="1440" w:hanging="360"/>
+      </w:pPr>
+      <w:rPr>
+        <w:rFonts w:ascii="Courier New" w:hAnsi="Courier New" w:hint="default"/>
+        <w:sz w:val="20"/>
+      </w:rPr>
+    </w:lvl>
+    <w:lvl w:ilvl="2" w:tentative="1">
+      <w:start w:val="1"/>
+      <w:numFmt w:val="bullet"/>
+      <w:lvlText w:val=""/>
+      <w:lvlJc w:val="left"/>
+      <w:pPr>
+        <w:tabs>
+          <w:tab w:val="num" w:pos="2160"/>
+        </w:tabs>
+        <w:ind w:left="2160" w:hanging="360"/>
+      </w:pPr>
+      <w:rPr>
+        <w:rFonts w:ascii="Wingdings" w:hAnsi="Wingdings" w:hint="default"/>
+        <w:sz w:val="20"/>
+      </w:rPr>
+    </w:lvl>
+    <w:lvl w:ilvl="3" w:tentative="1">
+      <w:start w:val="1"/>
+      <w:numFmt w:val="bullet"/>
+      <w:lvlText w:val=""/>
+      <w:lvlJc w:val="left"/>
+      <w:pPr>
+        <w:tabs>
+          <w:tab w:val="num" w:pos="2880"/>
+        </w:tabs>
+        <w:ind w:left="2880" w:hanging="360"/>
+      </w:pPr>
+      <w:rPr>
+        <w:rFonts w:ascii="Wingdings" w:hAnsi="Wingdings" w:hint="default"/>
+        <w:sz w:val="20"/>
+      </w:rPr>
+    </w:lvl>
+    <w:lvl w:ilvl="4" w:tentative="1">
+      <w:start w:val="1"/>
+      <w:numFmt w:val="bullet"/>
+      <w:lvlText w:val=""/>
+      <w:lvlJc w:val="left"/>
+      <w:pPr>
+        <w:tabs>
+          <w:tab w:val="num" w:pos="3600"/>
+        </w:tabs>
+        <w:ind w:left="3600" w:hanging="360"/>
+      </w:pPr>
+      <w:rPr>
+        <w:rFonts w:ascii="Wingdings" w:hAnsi="Wingdings" w:hint="default"/>
+        <w:sz w:val="20"/>
+      </w:rPr>
+    </w:lvl>
+    <w:lvl w:ilvl="5" w:tentative="1">
+      <w:start w:val="1"/>
+      <w:numFmt w:val="bullet"/>
+      <w:lvlText w:val=""/>
+      <w:lvlJc w:val="left"/>
+      <w:pPr>
+        <w:tabs>
+          <w:tab w:val="num" w:pos="4320"/>
+        </w:tabs>
+        <w:ind w:left="4320" w:hanging="360"/>
+      </w:pPr>
+      <w:rPr>
+        <w:rFonts w:ascii="Wingdings" w:hAnsi="Wingdings" w:hint="default"/>
+        <w:sz w:val="20"/>
+      </w:rPr>
+    </w:lvl>
+    <w:lvl w:ilvl="6" w:tentative="1">
+      <w:start w:val="1"/>
+      <w:numFmt w:val="bullet"/>
+      <w:lvlText w:val=""/>
+      <w:lvlJc w:val="left"/>
+      <w:pPr>
+        <w:tabs>
+          <w:tab w:val="num" w:pos="5040"/>
+        </w:tabs>
+        <w:ind w:left="5040" w:hanging="360"/>
+      </w:pPr>
+      <w:rPr>
+        <w:rFonts w:ascii="Wingdings" w:hAnsi="Wingdings" w:hint="default"/>
+        <w:sz w:val="20"/>
+      </w:rPr>
+    </w:lvl>
+    <w:lvl w:ilvl="7" w:tentative="1">
+      <w:start w:val="1"/>
+      <w:numFmt w:val="bullet"/>
+      <w:lvlText w:val=""/>
+      <w:lvlJc w:val="left"/>
+      <w:pPr>
+        <w:tabs>
+          <w:tab w:val="num" w:pos="5760"/>
+        </w:tabs>
+        <w:ind w:left="5760" w:hanging="360"/>
+      </w:pPr>
+      <w:rPr>
+        <w:rFonts w:ascii="Wingdings" w:hAnsi="Wingdings" w:hint="default"/>
+        <w:sz w:val="20"/>
+      </w:rPr>
+    </w:lvl>
+    <w:lvl w:ilvl="8" w:tentative="1">
+      <w:start w:val="1"/>
+      <w:numFmt w:val="bullet"/>
+      <w:lvlText w:val=""/>
+      <w:lvlJc w:val="left"/>
+      <w:pPr>
+        <w:tabs>
+          <w:tab w:val="num" w:pos="6480"/>
+        </w:tabs>
+        <w:ind w:left="6480" w:hanging="360"/>
+      </w:pPr>
+      <w:rPr>
+        <w:rFonts w:ascii="Wingdings" w:hAnsi="Wingdings" w:hint="default"/>
+        <w:sz w:val="20"/>
+      </w:rPr>
+    </w:lvl>
+  </w:abstractNum>
+  <w:abstractNum w:abstractNumId="3" w15:restartNumberingAfterBreak="0">
     <w:nsid w:val="76C8333F"/>
     <w:multiLevelType w:val="multilevel"/>
     <w:tmpl w:val="639E03A2"/>
@@ -1831,14 +3363,137 @@
       </w:rPr>
     </w:lvl>
   </w:abstractNum>
+  <w:abstractNum w:abstractNumId="4" w15:restartNumberingAfterBreak="0">
+    <w:nsid w:val="7AAA2A63"/>
+    <w:multiLevelType w:val="multilevel"/>
+    <w:tmpl w:val="9976EC0E"/>
+    <w:lvl w:ilvl="0">
+      <w:start w:val="1"/>
+      <w:numFmt w:val="decimal"/>
+      <w:lvlText w:val="%1."/>
+      <w:lvlJc w:val="left"/>
+      <w:pPr>
+        <w:tabs>
+          <w:tab w:val="num" w:pos="720"/>
+        </w:tabs>
+        <w:ind w:left="720" w:hanging="360"/>
+      </w:pPr>
+    </w:lvl>
+    <w:lvl w:ilvl="1">
+      <w:start w:val="1"/>
+      <w:numFmt w:val="bullet"/>
+      <w:lvlText w:val="o"/>
+      <w:lvlJc w:val="left"/>
+      <w:pPr>
+        <w:tabs>
+          <w:tab w:val="num" w:pos="1440"/>
+        </w:tabs>
+        <w:ind w:left="1440" w:hanging="360"/>
+      </w:pPr>
+      <w:rPr>
+        <w:rFonts w:ascii="Courier New" w:hAnsi="Courier New" w:hint="default"/>
+        <w:sz w:val="20"/>
+      </w:rPr>
+    </w:lvl>
+    <w:lvl w:ilvl="2" w:tentative="1">
+      <w:start w:val="1"/>
+      <w:numFmt w:val="decimal"/>
+      <w:lvlText w:val="%3."/>
+      <w:lvlJc w:val="left"/>
+      <w:pPr>
+        <w:tabs>
+          <w:tab w:val="num" w:pos="2160"/>
+        </w:tabs>
+        <w:ind w:left="2160" w:hanging="360"/>
+      </w:pPr>
+    </w:lvl>
+    <w:lvl w:ilvl="3" w:tentative="1">
+      <w:start w:val="1"/>
+      <w:numFmt w:val="decimal"/>
+      <w:lvlText w:val="%4."/>
+      <w:lvlJc w:val="left"/>
+      <w:pPr>
+        <w:tabs>
+          <w:tab w:val="num" w:pos="2880"/>
+        </w:tabs>
+        <w:ind w:left="2880" w:hanging="360"/>
+      </w:pPr>
+    </w:lvl>
+    <w:lvl w:ilvl="4" w:tentative="1">
+      <w:start w:val="1"/>
+      <w:numFmt w:val="decimal"/>
+      <w:lvlText w:val="%5."/>
+      <w:lvlJc w:val="left"/>
+      <w:pPr>
+        <w:tabs>
+          <w:tab w:val="num" w:pos="3600"/>
+        </w:tabs>
+        <w:ind w:left="3600" w:hanging="360"/>
+      </w:pPr>
+    </w:lvl>
+    <w:lvl w:ilvl="5" w:tentative="1">
+      <w:start w:val="1"/>
+      <w:numFmt w:val="decimal"/>
+      <w:lvlText w:val="%6."/>
+      <w:lvlJc w:val="left"/>
+      <w:pPr>
+        <w:tabs>
+          <w:tab w:val="num" w:pos="4320"/>
+        </w:tabs>
+        <w:ind w:left="4320" w:hanging="360"/>
+      </w:pPr>
+    </w:lvl>
+    <w:lvl w:ilvl="6" w:tentative="1">
+      <w:start w:val="1"/>
+      <w:numFmt w:val="decimal"/>
+      <w:lvlText w:val="%7."/>
+      <w:lvlJc w:val="left"/>
+      <w:pPr>
+        <w:tabs>
+          <w:tab w:val="num" w:pos="5040"/>
+        </w:tabs>
+        <w:ind w:left="5040" w:hanging="360"/>
+      </w:pPr>
+    </w:lvl>
+    <w:lvl w:ilvl="7" w:tentative="1">
+      <w:start w:val="1"/>
+      <w:numFmt w:val="decimal"/>
+      <w:lvlText w:val="%8."/>
+      <w:lvlJc w:val="left"/>
+      <w:pPr>
+        <w:tabs>
+          <w:tab w:val="num" w:pos="5760"/>
+        </w:tabs>
+        <w:ind w:left="5760" w:hanging="360"/>
+      </w:pPr>
+    </w:lvl>
+    <w:lvl w:ilvl="8" w:tentative="1">
+      <w:start w:val="1"/>
+      <w:numFmt w:val="decimal"/>
+      <w:lvlText w:val="%9."/>
+      <w:lvlJc w:val="left"/>
+      <w:pPr>
+        <w:tabs>
+          <w:tab w:val="num" w:pos="6480"/>
+        </w:tabs>
+        <w:ind w:left="6480" w:hanging="360"/>
+      </w:pPr>
+    </w:lvl>
+  </w:abstractNum>
   <w:num w:numId="1" w16cid:durableId="1679965956">
-    <w:abstractNumId w:val="2"/>
+    <w:abstractNumId w:val="3"/>
   </w:num>
   <w:num w:numId="2" w16cid:durableId="779683873">
     <w:abstractNumId w:val="0"/>
   </w:num>
   <w:num w:numId="3" w16cid:durableId="1005329615">
     <w:abstractNumId w:val="1"/>
+  </w:num>
+  <w:num w:numId="4" w16cid:durableId="626543857">
+    <w:abstractNumId w:val="2"/>
+  </w:num>
+  <w:num w:numId="5" w16cid:durableId="781922086">
+    <w:abstractNumId w:val="4"/>
   </w:num>
 </w:numbering>
 </file>
@@ -2761,6 +4416,90 @@
       <w:spacing w:val="5"/>
     </w:rPr>
   </w:style>
+  <w:style w:type="paragraph" w:styleId="HTML">
+    <w:name w:val="HTML Preformatted"/>
+    <w:basedOn w:val="a"/>
+    <w:link w:val="HTML0"/>
+    <w:uiPriority w:val="99"/>
+    <w:semiHidden/>
+    <w:unhideWhenUsed/>
+    <w:rsid w:val="002C249D"/>
+    <w:pPr>
+      <w:spacing w:after="0" w:line="240" w:lineRule="auto"/>
+    </w:pPr>
+    <w:rPr>
+      <w:rFonts w:ascii="Consolas" w:hAnsi="Consolas"/>
+      <w:sz w:val="20"/>
+      <w:szCs w:val="20"/>
+    </w:rPr>
+  </w:style>
+  <w:style w:type="character" w:customStyle="1" w:styleId="HTML0">
+    <w:name w:val="Стандартный HTML Знак"/>
+    <w:basedOn w:val="a0"/>
+    <w:link w:val="HTML"/>
+    <w:uiPriority w:val="99"/>
+    <w:semiHidden/>
+    <w:rsid w:val="002C249D"/>
+    <w:rPr>
+      <w:rFonts w:ascii="Consolas" w:hAnsi="Consolas"/>
+      <w:sz w:val="20"/>
+      <w:szCs w:val="20"/>
+    </w:rPr>
+  </w:style>
+  <w:style w:type="character" w:styleId="ac">
+    <w:name w:val="Hyperlink"/>
+    <w:basedOn w:val="a0"/>
+    <w:uiPriority w:val="99"/>
+    <w:unhideWhenUsed/>
+    <w:rsid w:val="00EC2075"/>
+    <w:rPr>
+      <w:color w:val="0563C1" w:themeColor="hyperlink"/>
+      <w:u w:val="single"/>
+    </w:rPr>
+  </w:style>
+  <w:style w:type="character" w:styleId="ad">
+    <w:name w:val="Unresolved Mention"/>
+    <w:basedOn w:val="a0"/>
+    <w:uiPriority w:val="99"/>
+    <w:semiHidden/>
+    <w:unhideWhenUsed/>
+    <w:rsid w:val="00EC2075"/>
+    <w:rPr>
+      <w:color w:val="605E5C"/>
+      <w:shd w:val="clear" w:color="auto" w:fill="E1DFDD"/>
+    </w:rPr>
+  </w:style>
+  <w:style w:type="character" w:styleId="ae">
+    <w:name w:val="FollowedHyperlink"/>
+    <w:basedOn w:val="a0"/>
+    <w:uiPriority w:val="99"/>
+    <w:semiHidden/>
+    <w:unhideWhenUsed/>
+    <w:rsid w:val="00615930"/>
+    <w:rPr>
+      <w:color w:val="954F72" w:themeColor="followedHyperlink"/>
+      <w:u w:val="single"/>
+    </w:rPr>
+  </w:style>
+  <w:style w:type="paragraph" w:styleId="af">
+    <w:name w:val="caption"/>
+    <w:basedOn w:val="a"/>
+    <w:next w:val="a"/>
+    <w:uiPriority w:val="35"/>
+    <w:unhideWhenUsed/>
+    <w:qFormat/>
+    <w:rsid w:val="00335BCD"/>
+    <w:pPr>
+      <w:spacing w:after="200" w:line="240" w:lineRule="auto"/>
+    </w:pPr>
+    <w:rPr>
+      <w:i/>
+      <w:iCs/>
+      <w:color w:val="44546A" w:themeColor="text2"/>
+      <w:sz w:val="18"/>
+      <w:szCs w:val="18"/>
+    </w:rPr>
+  </w:style>
 </w:styles>
 </file>
 

</xml_diff>